<commit_message>
Tianxia - fully analised
</commit_message>
<xml_diff>
--- a/Constructivism/Tianxia and Its Decolonial Counterparts - Shuchen Xiang.docx
+++ b/Constructivism/Tianxia and Its Decolonial Counterparts - Shuchen Xiang.docx
@@ -25,40 +25,6 @@
           <w:lang w:val="en-US"/>
         </w:rPr>
       </w:pPr>
-    </w:p>
-    <w:p>
-      <w:pPr>
-        <w:jc w:val="both"/>
-        <w:rPr>
-          <w:lang w:val="en-US"/>
-        </w:rPr>
-      </w:pPr>
-      <w:r>
-        <w:rPr>
-          <w:lang w:val="en-US"/>
-        </w:rPr>
-        <w:t xml:space="preserve">(WIP) – </w:t>
-      </w:r>
-      <w:r>
-        <w:rPr>
-          <w:lang w:val="en-US"/>
-        </w:rPr>
-        <w:t>stoped</w:t>
-      </w:r>
-      <w:r>
-        <w:rPr>
-          <w:lang w:val="en-US"/>
-        </w:rPr>
-        <w:t xml:space="preserve"> on page 175</w:t>
-      </w:r>
-    </w:p>
-    <w:p>
-      <w:pPr>
-        <w:jc w:val="both"/>
-        <w:rPr>
-          <w:lang w:val="en-US"/>
-        </w:rPr>
-      </w:pPr>
       <w:r>
         <w:rPr>
           <w:lang w:val="en-US"/>
@@ -440,14 +406,14 @@
         <w:rPr>
           <w:lang w:val="en-US"/>
         </w:rPr>
-        <w:t xml:space="preserve"> “most potent and persistent idea in the West for the general order of things” – Single, deterministic, completely rational -&gt; I would </w:t>
+        <w:t xml:space="preserve"> “most potent and persistent idea in the West for the general order of things” – Single, deterministic, completely rational -&gt; I would very, VERY strongly disagree with the statement that this is main idea of the western philosophers. Each of those points. Rationality of the world, determinism and compliteness are not only questioned or doubted if not </w:t>
       </w:r>
       <w:r>
         <w:rPr>
           <w:lang w:val="en-US"/>
         </w:rPr>
         <w:lastRenderedPageBreak/>
-        <w:t>very, VERY strongly disagree with the statement that this is main idea of the western philosophers. Each of those points. Rationality of the world, determinism and compliteness are not only questioned or doubted if not rebuked by more concepts, than those whom supports those (I don’t have numbers so it is only in ‘I believe’ category. Yes, we can find pieces of, for example determinism in ancient Greece (Fatum), Christianity (predestination) or Communism (materialism).. but really? Maybe I can’t see this because I personally refuse to believe in deterministic world</w:t>
+        <w:t>rebuked by more concepts, than those whom supports those (I don’t have numbers so it is only in ‘I believe’ category. Yes, we can find pieces of, for example determinism in ancient Greece (Fatum), Christianity (predestination) or Communism (materialism).. but really? Maybe I can’t see this because I personally refuse to believe in deterministic world</w:t>
       </w:r>
       <w:r>
         <w:rPr>
@@ -765,8 +731,14 @@
         <w:rPr>
           <w:lang w:val="en-US"/>
         </w:rPr>
+        <w:t xml:space="preserve">Authors describe western world order as hierarchical? Where Europeans are put on top, before all other netions. I think he confuses the Westphalian system (independent and sovereign states) with some kind of not existing order(maybe </w:t>
+      </w:r>
+      <w:r>
+        <w:rPr>
+          <w:lang w:val="en-US"/>
+        </w:rPr>
         <w:lastRenderedPageBreak/>
-        <w:t>Authors describe western world order as hierarchical? Where Europeans are put on top, before all other netions. I think he confuses the Westphalian system (independent and sovereign states) with some kind of not existing order(maybe with the rasist supremacy?) Also describes anarchical world order as a hierarchical one with Europeans on top. I don’t think that there is, in IR (international relations) any established, official, school of thougth that would describe Western IR as hierarchical.</w:t>
+        <w:t>with the rasist supremacy?) Also describes anarchical world order as a hierarchical one with Europeans on top. I don’t think that there is, in IR (international relations) any established, official, school of thougth that would describe Western IR as hierarchical.</w:t>
       </w:r>
     </w:p>
     <w:p>
@@ -836,6 +808,270 @@
     </w:p>
     <w:p>
       <w:pPr>
+        <w:pStyle w:val="Akapitzlist"/>
+        <w:numPr>
+          <w:ilvl w:val="0"/>
+          <w:numId w:val="1"/>
+        </w:numPr>
+        <w:rPr>
+          <w:lang w:val="en-US"/>
+        </w:rPr>
+      </w:pPr>
+      <w:r>
+        <w:rPr>
+          <w:lang w:val="en-US"/>
+        </w:rPr>
+        <w:t>Author believes that multiculturalism assumes gradation of cultures, in contrast to Glissant’s concept of resonance between cultures</w:t>
+      </w:r>
+      <w:r>
+        <w:rPr>
+          <w:lang w:val="en-US"/>
+        </w:rPr>
+        <w:t xml:space="preserve"> (creolization)</w:t>
+      </w:r>
+      <w:r>
+        <w:rPr>
+          <w:rStyle w:val="Odwoanieprzypisudolnego"/>
+          <w:lang w:val="en-US"/>
+        </w:rPr>
+        <w:footnoteReference w:id="5"/>
+      </w:r>
+      <w:r>
+        <w:rPr>
+          <w:lang w:val="en-US"/>
+        </w:rPr>
+        <w:t>.</w:t>
+      </w:r>
+    </w:p>
+    <w:p>
+      <w:pPr>
+        <w:pStyle w:val="Akapitzlist"/>
+        <w:numPr>
+          <w:ilvl w:val="0"/>
+          <w:numId w:val="1"/>
+        </w:numPr>
+        <w:rPr>
+          <w:lang w:val="en-US"/>
+        </w:rPr>
+      </w:pPr>
+      <w:r>
+        <w:rPr>
+          <w:lang w:val="en-US"/>
+        </w:rPr>
+        <w:t>European experiment with multi-culti proves time after another that some cultural differences are just to big to merged</w:t>
+      </w:r>
+      <w:r>
+        <w:rPr>
+          <w:lang w:val="en-US"/>
+        </w:rPr>
+        <w:t>, adapted or asimilaited (*even if the analised text assumed that there is no such thing as assimilation of one culture into another)</w:t>
+      </w:r>
+      <w:r>
+        <w:rPr>
+          <w:lang w:val="en-US"/>
+        </w:rPr>
+        <w:t>. There are also cultures that just don’t want to assimilate with others out of the inner believes that they are just better (Jewish but also Chinesee, Japaneese, Greek or French)</w:t>
+      </w:r>
+    </w:p>
+    <w:p>
+      <w:pPr>
+        <w:pStyle w:val="Akapitzlist"/>
+        <w:numPr>
+          <w:ilvl w:val="0"/>
+          <w:numId w:val="1"/>
+        </w:numPr>
+        <w:rPr>
+          <w:lang w:val="en-US"/>
+        </w:rPr>
+      </w:pPr>
+      <w:r>
+        <w:rPr>
+          <w:lang w:val="en-US"/>
+        </w:rPr>
+        <w:t xml:space="preserve">Tong ( </w:t>
+      </w:r>
+      <w:r>
+        <w:rPr>
+          <w:rFonts w:hint="eastAsia"/>
+          <w:lang w:val="en-US"/>
+        </w:rPr>
+        <w:t>通</w:t>
+      </w:r>
+      <w:r>
+        <w:rPr>
+          <w:lang w:val="en-US"/>
+        </w:rPr>
+        <w:t xml:space="preserve"> </w:t>
+      </w:r>
+      <w:r>
+        <w:rPr>
+          <w:lang w:val="en-US"/>
+        </w:rPr>
+        <w:t>) -&gt; universal</w:t>
+      </w:r>
+      <w:r>
+        <w:rPr>
+          <w:lang w:val="en-US"/>
+        </w:rPr>
+        <w:t xml:space="preserve"> (unimpeded free-flowing interaction or relatipnship between sensate particulats.)</w:t>
+      </w:r>
+    </w:p>
+    <w:p>
+      <w:pPr>
+        <w:pStyle w:val="Akapitzlist"/>
+        <w:numPr>
+          <w:ilvl w:val="0"/>
+          <w:numId w:val="1"/>
+        </w:numPr>
+        <w:rPr>
+          <w:lang w:val="en-US"/>
+        </w:rPr>
+      </w:pPr>
+      <w:r>
+        <w:rPr>
+          <w:lang w:val="en-US"/>
+        </w:rPr>
+        <w:t>Qing (</w:t>
+      </w:r>
+      <w:r>
+        <w:rPr>
+          <w:rFonts w:hint="eastAsia"/>
+          <w:lang w:val="en-US"/>
+        </w:rPr>
+        <w:t>情</w:t>
+      </w:r>
+      <w:r>
+        <w:rPr>
+          <w:lang w:val="en-US"/>
+        </w:rPr>
+        <w:t xml:space="preserve"> )</w:t>
+      </w:r>
+      <w:r>
+        <w:rPr>
+          <w:lang w:val="en-US"/>
+        </w:rPr>
+        <w:t xml:space="preserve"> -&gt; feeling?</w:t>
+      </w:r>
+    </w:p>
+    <w:p>
+      <w:pPr>
+        <w:pStyle w:val="Akapitzlist"/>
+        <w:numPr>
+          <w:ilvl w:val="0"/>
+          <w:numId w:val="1"/>
+        </w:numPr>
+        <w:rPr>
+          <w:lang w:val="en-US"/>
+        </w:rPr>
+      </w:pPr>
+      <w:r>
+        <w:rPr>
+          <w:lang w:val="en-US"/>
+        </w:rPr>
+        <w:t>Gan (</w:t>
+      </w:r>
+      <w:r>
+        <w:rPr>
+          <w:rFonts w:hint="eastAsia"/>
+          <w:lang w:val="en-US"/>
+        </w:rPr>
+        <w:t>感</w:t>
+      </w:r>
+      <w:r>
+        <w:rPr>
+          <w:lang w:val="en-US"/>
+        </w:rPr>
+        <w:t xml:space="preserve"> )</w:t>
+      </w:r>
+    </w:p>
+    <w:p>
+      <w:pPr>
+        <w:pStyle w:val="Akapitzlist"/>
+        <w:numPr>
+          <w:ilvl w:val="0"/>
+          <w:numId w:val="1"/>
+        </w:numPr>
+        <w:rPr>
+          <w:lang w:val="en-US"/>
+        </w:rPr>
+      </w:pPr>
+      <w:r>
+        <w:rPr>
+          <w:lang w:val="en-US"/>
+        </w:rPr>
+        <w:t>Yi (</w:t>
+      </w:r>
+      <w:r>
+        <w:rPr>
+          <w:rFonts w:hint="eastAsia"/>
+          <w:lang w:val="en-US"/>
+        </w:rPr>
+        <w:t>易</w:t>
+      </w:r>
+      <w:r>
+        <w:rPr>
+          <w:lang w:val="en-US"/>
+        </w:rPr>
+        <w:t>) – change (mode o</w:t>
+      </w:r>
+      <w:r>
+        <w:rPr>
+          <w:lang w:val="en-US"/>
+        </w:rPr>
+        <w:t>f existence of China, constant change in relations with others… I think author of this ‘wholesome but not really’ idea blinds herself of periods of isolations of china like the Ming dynasty.</w:t>
+      </w:r>
+    </w:p>
+    <w:p>
+      <w:pPr>
+        <w:pStyle w:val="Akapitzlist"/>
+        <w:numPr>
+          <w:ilvl w:val="0"/>
+          <w:numId w:val="1"/>
+        </w:numPr>
+        <w:rPr>
+          <w:lang w:val="en-US"/>
+        </w:rPr>
+      </w:pPr>
+      <w:r>
+        <w:rPr>
+          <w:lang w:val="en-US"/>
+        </w:rPr>
+        <w:t>Chinese virtue and morality are synonymus with power and efficacy, the ability to influence charismatically but without overt effort the behavior of others in the same direction</w:t>
+      </w:r>
+    </w:p>
+    <w:p>
+      <w:pPr>
+        <w:pStyle w:val="Akapitzlist"/>
+        <w:numPr>
+          <w:ilvl w:val="0"/>
+          <w:numId w:val="1"/>
+        </w:numPr>
+        <w:rPr>
+          <w:lang w:val="en-US"/>
+        </w:rPr>
+      </w:pPr>
+      <w:r>
+        <w:rPr>
+          <w:lang w:val="en-US"/>
+        </w:rPr>
+        <w:lastRenderedPageBreak/>
+        <w:t xml:space="preserve">In the add-notes, author defends her view on hierarchical order of the east and west by standing on the position that eastern hierarchies were ‘harmonical’ </w:t>
+      </w:r>
+      <w:r>
+        <w:rPr>
+          <w:lang w:val="en-US"/>
+        </w:rPr>
+        <w:t xml:space="preserve"> and ‘meritocratic’, </w:t>
+      </w:r>
+      <w:r>
+        <w:rPr>
+          <w:lang w:val="en-US"/>
+        </w:rPr>
+        <w:t>everyone was doing theirs job and western hierarchy was racial where certain groups of people deemed to be worse than others. This idea could be defended only if we would see relations between metropolitan areas of the empire vs theirs colonies but not when we compare imperial states against each other or the sovereign states without colonies.</w:t>
+      </w:r>
+    </w:p>
+    <w:p>
+      <w:pPr>
         <w:rPr>
           <w:lang w:val="en-US"/>
         </w:rPr>
@@ -930,7 +1166,6 @@
         <w:rPr>
           <w:lang w:val="en-US"/>
         </w:rPr>
-        <w:lastRenderedPageBreak/>
         <w:t>Kenneth Waltz says that structure constrains behavior but there is still a place for mistakes, miscalculations. Favorisation of certain behaviors doesn’t mean that states will for sure behave in that way which breaks determinism.</w:t>
       </w:r>
     </w:p>
@@ -1101,6 +1336,34 @@
           <w:lang w:val="en-US"/>
         </w:rPr>
         <w:t>o ancient Greek culture is that… it is ancient. It influenced modern European world but it doesn’t determine it. Moreover, our current understanding of the universe makes us rebuke determinism.</w:t>
+      </w:r>
+    </w:p>
+  </w:footnote>
+  <w:footnote w:id="5">
+    <w:p>
+      <w:pPr>
+        <w:pStyle w:val="Tekstprzypisudolnego"/>
+        <w:rPr>
+          <w:lang w:val="en-US"/>
+        </w:rPr>
+      </w:pPr>
+      <w:r>
+        <w:rPr>
+          <w:rStyle w:val="Odwoanieprzypisudolnego"/>
+        </w:rPr>
+        <w:footnoteRef/>
+      </w:r>
+      <w:r>
+        <w:rPr>
+          <w:lang w:val="en-US"/>
+        </w:rPr>
+        <w:t xml:space="preserve"> Isint american culture a one b</w:t>
+      </w:r>
+      <w:r>
+        <w:rPr>
+          <w:lang w:val="en-US"/>
+        </w:rPr>
+        <w:t>ig melting pod of multiple cultures?</w:t>
       </w:r>
     </w:p>
   </w:footnote>
@@ -1830,6 +2093,7 @@
   <w:style w:type="character" w:default="1" w:styleId="Domylnaczcionkaakapitu">
     <w:name w:val="Default Paragraph Font"/>
     <w:uiPriority w:val="1"/>
+    <w:semiHidden/>
     <w:unhideWhenUsed/>
   </w:style>
   <w:style w:type="table" w:default="1" w:styleId="Standardowy">
@@ -2203,6 +2467,18 @@
     <w:rPr>
       <w:color w:val="605E5C"/>
       <w:shd w:val="clear" w:color="auto" w:fill="E1DFDD"/>
+    </w:rPr>
+  </w:style>
+  <w:style w:type="character" w:styleId="UyteHipercze">
+    <w:name w:val="FollowedHyperlink"/>
+    <w:basedOn w:val="Domylnaczcionkaakapitu"/>
+    <w:uiPriority w:val="99"/>
+    <w:semiHidden/>
+    <w:unhideWhenUsed/>
+    <w:rsid w:val="00E4025D"/>
+    <w:rPr>
+      <w:color w:val="96607D" w:themeColor="followedHyperlink"/>
+      <w:u w:val="single"/>
     </w:rPr>
   </w:style>
 </w:styles>

</xml_diff>